<commit_message>
Build WPA submission artifacts
</commit_message>
<xml_diff>
--- a/WPA_Submission/docs/00_รายการเอกสารและแนวทางจัดชุดส่งงาน.docx
+++ b/WPA_Submission/docs/00_รายการเอกสารและแนวทางจัดชุดส่งงาน.docx
@@ -2,42 +2,40 @@
 <file path=word/document.xml><?xml version="1.0" encoding="utf-8"?>
 <w:document xmlns:w="http://schemas.openxmlformats.org/wordprocessingml/2006/main" xmlns:m="http://schemas.openxmlformats.org/officeDocument/2006/math" xmlns:r="http://schemas.openxmlformats.org/officeDocument/2006/relationships" xmlns:o="urn:schemas-microsoft-com:office:office" xmlns:v="urn:schemas-microsoft-com:vml" xmlns:w10="urn:schemas-microsoft-com:office:word" xmlns:a="http://schemas.openxmlformats.org/drawingml/2006/main" xmlns:pic="http://schemas.openxmlformats.org/drawingml/2006/picture" xmlns:wp="http://schemas.openxmlformats.org/drawingml/2006/wordprocessingDrawing">
   <w:body>
+    <w:bookmarkStart w:id="21" w:name="wpa-submission-package"/>
+    <w:p>
+      <w:pPr>
+        <w:pStyle w:val="Heading1"/>
+      </w:pPr>
+      <w:r>
+        <w:t xml:space="preserve">WPA Submission Package</w:t>
+      </w:r>
+    </w:p>
+    <w:bookmarkStart w:id="20" w:name="Xc4f30a0cfa0ab3f9e877964eabf68578325c56b"/>
+    <w:p>
+      <w:pPr>
+        <w:pStyle w:val="Heading2"/>
+      </w:pPr>
+      <w:r>
+        <w:t xml:space="preserve">รายการเอกสารและแนวทางจัดชุดส่งงาน — หน่วยที่ 3 การพัฒนาโครงงาน</w:t>
+      </w:r>
+    </w:p>
     <w:p>
       <w:pPr>
         <w:pStyle w:val="FirstParagraph"/>
-      </w:pPr>
-      <w:r>
-        <w:t xml:space="preserve">**</w:t>
-      </w:r>
-      <w:r>
-        <w:br/>
-      </w:r>
-      <w:r>
-        <w:t xml:space="preserve">WPA Submission Package**</w:t>
-      </w:r>
-    </w:p>
-    <w:p>
-      <w:pPr>
-        <w:pStyle w:val="BodyText"/>
       </w:pPr>
       <w:r>
         <w:rPr>
           <w:bCs/>
           <w:b/>
         </w:rPr>
-        <w:t xml:space="preserve">รายการเอกสารและแนวทางจัดชุดส่งงาน</w:t>
-      </w:r>
-    </w:p>
-    <w:p>
-      <w:pPr>
-        <w:pStyle w:val="BodyText"/>
-      </w:pPr>
-      <w:r>
-        <w:rPr>
-          <w:bCs/>
-          <w:b/>
-        </w:rPr>
-        <w:t xml:space="preserve">AI to ESP32</w:t>
+        <w:t xml:space="preserve">กิจกรรม:</w:t>
+      </w:r>
+      <w:r>
+        <w:t xml:space="preserve"> </w:t>
+      </w:r>
+      <w:r>
+        <w:t xml:space="preserve">การพัฒนาต้นแบบระบบควบคุมแบบไม่สัมผัสด้วย AI และ ESP32 โดยใช้แนวคิดเชิงคำนวณ</w:t>
       </w:r>
     </w:p>
     <w:tbl>
@@ -63,23 +61,19 @@
               <w:jc w:val="left"/>
             </w:pPr>
             <w:r>
-              <w:rPr>
-                <w:bCs/>
-                <w:b/>
-              </w:rPr>
-              <w:t xml:space="preserve">รายวิชา</w:t>
-            </w:r>
-          </w:p>
-        </w:tc>
-        <w:tc>
-          <w:tcPr/>
-          <w:p>
-            <w:pPr>
-              <w:pStyle w:val="Compact"/>
-              <w:jc w:val="left"/>
-            </w:pPr>
-            <w:r>
-              <w:t xml:space="preserve">เทคโนโลยี (วิทยาการคำนวณ 1) ว31101</w:t>
+              <w:t xml:space="preserve">รายการ</w:t>
+            </w:r>
+          </w:p>
+        </w:tc>
+        <w:tc>
+          <w:tcPr/>
+          <w:p>
+            <w:pPr>
+              <w:pStyle w:val="Compact"/>
+              <w:jc w:val="left"/>
+            </w:pPr>
+            <w:r>
+              <w:t xml:space="preserve">ข้อมูล</w:t>
             </w:r>
           </w:p>
         </w:tc>
@@ -93,23 +87,19 @@
               <w:jc w:val="left"/>
             </w:pPr>
             <w:r>
-              <w:rPr>
-                <w:bCs/>
-                <w:b/>
-              </w:rPr>
-              <w:t xml:space="preserve">ชั้น</w:t>
-            </w:r>
-          </w:p>
-        </w:tc>
-        <w:tc>
-          <w:tcPr/>
-          <w:p>
-            <w:pPr>
-              <w:pStyle w:val="Compact"/>
-              <w:jc w:val="left"/>
-            </w:pPr>
-            <w:r>
-              <w:t xml:space="preserve">มัธยมศึกษาปีที่ 4/5</w:t>
+              <w:t xml:space="preserve">รายวิชา</w:t>
+            </w:r>
+          </w:p>
+        </w:tc>
+        <w:tc>
+          <w:tcPr/>
+          <w:p>
+            <w:pPr>
+              <w:pStyle w:val="Compact"/>
+              <w:jc w:val="left"/>
+            </w:pPr>
+            <w:r>
+              <w:t xml:space="preserve">เทคโนโลยี (วิทยาการคำนวณ 1) ว31101</w:t>
             </w:r>
           </w:p>
         </w:tc>
@@ -123,23 +113,19 @@
               <w:jc w:val="left"/>
             </w:pPr>
             <w:r>
-              <w:rPr>
-                <w:bCs/>
-                <w:b/>
-              </w:rPr>
-              <w:t xml:space="preserve">จำนวนนักเรียน</w:t>
-            </w:r>
-          </w:p>
-        </w:tc>
-        <w:tc>
-          <w:tcPr/>
-          <w:p>
-            <w:pPr>
-              <w:pStyle w:val="Compact"/>
-              <w:jc w:val="left"/>
-            </w:pPr>
-            <w:r>
-              <w:t xml:space="preserve">40 คน</w:t>
+              <w:t xml:space="preserve">ชั้น</w:t>
+            </w:r>
+          </w:p>
+        </w:tc>
+        <w:tc>
+          <w:tcPr/>
+          <w:p>
+            <w:pPr>
+              <w:pStyle w:val="Compact"/>
+              <w:jc w:val="left"/>
+            </w:pPr>
+            <w:r>
+              <w:t xml:space="preserve">มัธยมศึกษาปีที่ 4 (รองรับห้อง ม.4/1–ม.4/13)</w:t>
             </w:r>
           </w:p>
         </w:tc>
@@ -153,10 +139,6 @@
               <w:jc w:val="left"/>
             </w:pPr>
             <w:r>
-              <w:rPr>
-                <w:bCs/>
-                <w:b/>
-              </w:rPr>
               <w:t xml:space="preserve">ภาคเรียน</w:t>
             </w:r>
           </w:p>
@@ -183,10 +165,6 @@
               <w:jc w:val="left"/>
             </w:pPr>
             <w:r>
-              <w:rPr>
-                <w:bCs/>
-                <w:b/>
-              </w:rPr>
               <w:t xml:space="preserve">ครูผู้สอน</w:t>
             </w:r>
           </w:p>
@@ -213,10 +191,6 @@
               <w:jc w:val="left"/>
             </w:pPr>
             <w:r>
-              <w:rPr>
-                <w:bCs/>
-                <w:b/>
-              </w:rPr>
               <w:t xml:space="preserve">กลุ่มสาระ</w:t>
             </w:r>
           </w:p>
@@ -243,10 +217,6 @@
               <w:jc w:val="left"/>
             </w:pPr>
             <w:r>
-              <w:rPr>
-                <w:bCs/>
-                <w:b/>
-              </w:rPr>
               <w:t xml:space="preserve">รูปแบบ</w:t>
             </w:r>
           </w:p>
@@ -273,29 +243,86 @@
               <w:jc w:val="left"/>
             </w:pPr>
             <w:r>
-              <w:rPr>
-                <w:bCs/>
-                <w:b/>
-              </w:rPr>
-              <w:t xml:space="preserve">เวลา</w:t>
-            </w:r>
-          </w:p>
-        </w:tc>
-        <w:tc>
-          <w:tcPr/>
-          <w:p>
-            <w:pPr>
-              <w:pStyle w:val="Compact"/>
-              <w:jc w:val="left"/>
-            </w:pPr>
-            <w:r>
-              <w:t xml:space="preserve">1 คาบเรียน 50 นาที</w:t>
+              <w:t xml:space="preserve">เวลาแผนตัวอย่าง</w:t>
+            </w:r>
+          </w:p>
+        </w:tc>
+        <w:tc>
+          <w:tcPr/>
+          <w:p>
+            <w:pPr>
+              <w:pStyle w:val="Compact"/>
+              <w:jc w:val="left"/>
+            </w:pPr>
+            <w:r>
+              <w:t xml:space="preserve">1 คาบ 50 นาที</w:t>
+            </w:r>
+          </w:p>
+        </w:tc>
+      </w:tr>
+      <w:tr>
+        <w:tc>
+          <w:tcPr/>
+          <w:p>
+            <w:pPr>
+              <w:pStyle w:val="Compact"/>
+              <w:jc w:val="left"/>
+            </w:pPr>
+            <w:r>
+              <w:t xml:space="preserve">ตำแหน่งในรายวิชา</w:t>
+            </w:r>
+          </w:p>
+        </w:tc>
+        <w:tc>
+          <w:tcPr/>
+          <w:p>
+            <w:pPr>
+              <w:pStyle w:val="Compact"/>
+              <w:jc w:val="left"/>
+            </w:pPr>
+            <w:r>
+              <w:t xml:space="preserve">หน่วยที่ 3 การพัฒนาโครงงาน (22 ชั่วโมง) — เสนอใช้เป็นชั่วโมงที่ 9</w:t>
+            </w:r>
+          </w:p>
+        </w:tc>
+      </w:tr>
+      <w:tr>
+        <w:tc>
+          <w:tcPr/>
+          <w:p>
+            <w:pPr>
+              <w:pStyle w:val="Compact"/>
+              <w:jc w:val="left"/>
+            </w:pPr>
+            <w:r>
+              <w:t xml:space="preserve">ตัวชี้วัด</w:t>
+            </w:r>
+          </w:p>
+        </w:tc>
+        <w:tc>
+          <w:tcPr/>
+          <w:p>
+            <w:pPr>
+              <w:pStyle w:val="Compact"/>
+              <w:jc w:val="left"/>
+            </w:pPr>
+            <w:r>
+              <w:t xml:space="preserve">ว 4.2 ม.4/1</w:t>
             </w:r>
           </w:p>
         </w:tc>
       </w:tr>
     </w:tbl>
-    <w:bookmarkStart w:id="20" w:name="ไฟล์ในชุด"/>
+    <w:p>
+      <w:r>
+        <w:pict>
+          <v:rect style="width:0;height:1.5pt" o:hralign="center" o:hrstd="t" o:hr="t"/>
+        </w:pict>
+      </w:r>
+    </w:p>
+    <w:bookmarkEnd w:id="20"/>
+    <w:bookmarkEnd w:id="21"/>
+    <w:bookmarkStart w:id="22" w:name="ไฟล์ในชุด"/>
     <w:p>
       <w:pPr>
         <w:pStyle w:val="Heading1"/>
@@ -328,10 +355,6 @@
               <w:jc w:val="left"/>
             </w:pPr>
             <w:r>
-              <w:rPr>
-                <w:bCs/>
-                <w:b/>
-              </w:rPr>
               <w:t xml:space="preserve">ไฟล์</w:t>
             </w:r>
           </w:p>
@@ -344,10 +367,6 @@
               <w:jc w:val="left"/>
             </w:pPr>
             <w:r>
-              <w:rPr>
-                <w:bCs/>
-                <w:b/>
-              </w:rPr>
               <w:t xml:space="preserve">ใช้ทำอะไร</w:t>
             </w:r>
           </w:p>
@@ -360,11 +379,7 @@
               <w:jc w:val="left"/>
             </w:pPr>
             <w:r>
-              <w:rPr>
-                <w:bCs/>
-                <w:b/>
-              </w:rPr>
-              <w:t xml:space="preserve">ควรแนบส่งหรือไม่</w:t>
+              <w:t xml:space="preserve">สถานะ</w:t>
             </w:r>
           </w:p>
         </w:tc>
@@ -390,19 +405,19 @@
               <w:jc w:val="left"/>
             </w:pPr>
             <w:r>
-              <w:t xml:space="preserve">แผน 50 นาทีฉบับเต็ม พร้อมเชื่อมโยงตัวชี้วัด วPA</w:t>
-            </w:r>
-          </w:p>
-        </w:tc>
-        <w:tc>
-          <w:tcPr/>
-          <w:p>
-            <w:pPr>
-              <w:pStyle w:val="Compact"/>
-              <w:jc w:val="left"/>
-            </w:pPr>
-            <w:r>
-              <w:t xml:space="preserve">แนบ/เก็บเป็นหลักฐาน</w:t>
+              <w:t xml:space="preserve">แผน 50 นาที เชื่อม Unit 3, 5E, Debugging, Application</w:t>
+            </w:r>
+          </w:p>
+        </w:tc>
+        <w:tc>
+          <w:tcPr/>
+          <w:p>
+            <w:pPr>
+              <w:pStyle w:val="Compact"/>
+              <w:jc w:val="left"/>
+            </w:pPr>
+            <w:r>
+              <w:t xml:space="preserve">หลักฐานหลัก</w:t>
             </w:r>
           </w:p>
         </w:tc>
@@ -428,19 +443,19 @@
               <w:jc w:val="left"/>
             </w:pPr>
             <w:r>
-              <w:t xml:space="preserve">Station Cards, Flow, Peer Teaching, Challenge 8 กลุ่ม, Reflection</w:t>
-            </w:r>
-          </w:p>
-        </w:tc>
-        <w:tc>
-          <w:tcPr/>
-          <w:p>
-            <w:pPr>
-              <w:pStyle w:val="Compact"/>
-              <w:jc w:val="left"/>
-            </w:pPr>
-            <w:r>
-              <w:t xml:space="preserve">แนบ/เก็บเป็นหลักฐาน</w:t>
+              <w:t xml:space="preserve">IPO, System Flow, 3 Stations, Challenge, Application Design Card</w:t>
+            </w:r>
+          </w:p>
+        </w:tc>
+        <w:tc>
+          <w:tcPr/>
+          <w:p>
+            <w:pPr>
+              <w:pStyle w:val="Compact"/>
+              <w:jc w:val="left"/>
+            </w:pPr>
+            <w:r>
+              <w:t xml:space="preserve">หลักฐานผู้เรียน</w:t>
             </w:r>
           </w:p>
         </w:tc>
@@ -466,19 +481,19 @@
               <w:jc w:val="left"/>
             </w:pPr>
             <w:r>
-              <w:t xml:space="preserve">Rubric, สมรรถนะ, คุณลักษณะ, ตารางคะแนน</w:t>
-            </w:r>
-          </w:p>
-        </w:tc>
-        <w:tc>
-          <w:tcPr/>
-          <w:p>
-            <w:pPr>
-              <w:pStyle w:val="Compact"/>
-              <w:jc w:val="left"/>
-            </w:pPr>
-            <w:r>
-              <w:t xml:space="preserve">แนบ/เก็บเป็นหลักฐาน</w:t>
+              <w:t xml:space="preserve">Rubric 90 คะแนน + Post-test 10 คะแนน</w:t>
+            </w:r>
+          </w:p>
+        </w:tc>
+        <w:tc>
+          <w:tcPr/>
+          <w:p>
+            <w:pPr>
+              <w:pStyle w:val="Compact"/>
+              <w:jc w:val="left"/>
+            </w:pPr>
+            <w:r>
+              <w:t xml:space="preserve">หลักฐานประเมิน</w:t>
             </w:r>
           </w:p>
         </w:tc>
@@ -504,19 +519,19 @@
               <w:jc w:val="left"/>
             </w:pPr>
             <w:r>
-              <w:t xml:space="preserve">สคริปต์รายนาที, Shot list, Checklist</w:t>
-            </w:r>
-          </w:p>
-        </w:tc>
-        <w:tc>
-          <w:tcPr/>
-          <w:p>
-            <w:pPr>
-              <w:pStyle w:val="Compact"/>
-              <w:jc w:val="left"/>
-            </w:pPr>
-            <w:r>
-              <w:t xml:space="preserve">แนบ/เก็บเป็นหลักฐาน</w:t>
+              <w:t xml:space="preserve">สคริปต์รายนาที คำถามชี้นำ และ Shot List</w:t>
+            </w:r>
+          </w:p>
+        </w:tc>
+        <w:tc>
+          <w:tcPr/>
+          <w:p>
+            <w:pPr>
+              <w:pStyle w:val="Compact"/>
+              <w:jc w:val="left"/>
+            </w:pPr>
+            <w:r>
+              <w:t xml:space="preserve">คู่มือสอน/วิดีโอ</w:t>
             </w:r>
           </w:p>
         </w:tc>
@@ -542,19 +557,19 @@
               <w:jc w:val="left"/>
             </w:pPr>
             <w:r>
-              <w:t xml:space="preserve">คำถาม 10 ข้อและเฉลย</w:t>
-            </w:r>
-          </w:p>
-        </w:tc>
-        <w:tc>
-          <w:tcPr/>
-          <w:p>
-            <w:pPr>
-              <w:pStyle w:val="Compact"/>
-              <w:jc w:val="left"/>
-            </w:pPr>
-            <w:r>
-              <w:t xml:space="preserve">แนบ/เก็บเป็นหลักฐาน</w:t>
+              <w:t xml:space="preserve">Post-test 10 ข้อ เกณฑ์ผ่าน 7/10</w:t>
+            </w:r>
+          </w:p>
+        </w:tc>
+        <w:tc>
+          <w:tcPr/>
+          <w:p>
+            <w:pPr>
+              <w:pStyle w:val="Compact"/>
+              <w:jc w:val="left"/>
+            </w:pPr>
+            <w:r>
+              <w:t xml:space="preserve">หลักฐานผลเรียน</w:t>
             </w:r>
           </w:p>
         </w:tc>
@@ -580,19 +595,19 @@
               <w:jc w:val="left"/>
             </w:pPr>
             <w:r>
-              <w:t xml:space="preserve">กรอกคะแนน/สรุปผ่านไม่ผ่าน/ภาพรวม</w:t>
-            </w:r>
-          </w:p>
-        </w:tc>
-        <w:tc>
-          <w:tcPr/>
-          <w:p>
-            <w:pPr>
-              <w:pStyle w:val="Compact"/>
-              <w:jc w:val="left"/>
-            </w:pPr>
-            <w:r>
-              <w:t xml:space="preserve">แนบ/เก็บเป็นหลักฐาน</w:t>
+              <w:t xml:space="preserve">ตารางคะแนนห้องละไม่เกิน 40 คน รองรับห้อง 1–13</w:t>
+            </w:r>
+          </w:p>
+        </w:tc>
+        <w:tc>
+          <w:tcPr/>
+          <w:p>
+            <w:pPr>
+              <w:pStyle w:val="Compact"/>
+              <w:jc w:val="left"/>
+            </w:pPr>
+            <w:r>
+              <w:t xml:space="preserve">สำรอง/สรุป</w:t>
             </w:r>
           </w:p>
         </w:tc>
@@ -606,31 +621,31 @@
               <w:jc w:val="left"/>
             </w:pPr>
             <w:r>
-              <w:t xml:space="preserve">media/AI-Hand-Quest-final.html</w:t>
-            </w:r>
-          </w:p>
-        </w:tc>
-        <w:tc>
-          <w:tcPr/>
-          <w:p>
-            <w:pPr>
-              <w:pStyle w:val="Compact"/>
-              <w:jc w:val="left"/>
-            </w:pPr>
-            <w:r>
-              <w:t xml:space="preserve">เกม AR สำหรับนักเรียน (สำรองแบบไฟล์)</w:t>
-            </w:r>
-          </w:p>
-        </w:tc>
-        <w:tc>
-          <w:tcPr/>
-          <w:p>
-            <w:pPr>
-              <w:pStyle w:val="Compact"/>
-              <w:jc w:val="left"/>
-            </w:pPr>
-            <w:r>
-              <w:t xml:space="preserve">แนบ/เก็บเป็นหลักฐาน</w:t>
+              <w:t xml:space="preserve">07_แบบประเมินก่อนเรียน_10ข้อ_พร้อมเฉลย.docx</w:t>
+            </w:r>
+          </w:p>
+        </w:tc>
+        <w:tc>
+          <w:tcPr/>
+          <w:p>
+            <w:pPr>
+              <w:pStyle w:val="Compact"/>
+              <w:jc w:val="left"/>
+            </w:pPr>
+            <w:r>
+              <w:t xml:space="preserve">Pre-test 10 ข้อ ใช้วินิจฉัย ไม่คิดคะแนนผลสัมฤทธิ์</w:t>
+            </w:r>
+          </w:p>
+        </w:tc>
+        <w:tc>
+          <w:tcPr/>
+          <w:p>
+            <w:pPr>
+              <w:pStyle w:val="Compact"/>
+              <w:jc w:val="left"/>
+            </w:pPr>
+            <w:r>
+              <w:t xml:space="preserve">หลักฐานก่อนเรียน</w:t>
             </w:r>
           </w:p>
         </w:tc>
@@ -644,31 +659,31 @@
               <w:jc w:val="left"/>
             </w:pPr>
             <w:r>
-              <w:t xml:space="preserve">media/AI-Hand-Quest-teacher-summary.html</w:t>
-            </w:r>
-          </w:p>
-        </w:tc>
-        <w:tc>
-          <w:tcPr/>
-          <w:p>
-            <w:pPr>
-              <w:pStyle w:val="Compact"/>
-              <w:jc w:val="left"/>
-            </w:pPr>
-            <w:r>
-              <w:t xml:space="preserve">หน้าสรุปผลครู (สำรองแบบไฟล์)</w:t>
-            </w:r>
-          </w:p>
-        </w:tc>
-        <w:tc>
-          <w:tcPr/>
-          <w:p>
-            <w:pPr>
-              <w:pStyle w:val="Compact"/>
-              <w:jc w:val="left"/>
-            </w:pPr>
-            <w:r>
-              <w:t xml:space="preserve">แนบ/เก็บเป็นหลักฐาน</w:t>
+              <w:t xml:space="preserve">08_แบบประเมินพัฒนาการรายบุคคล_AI_to_ESP32.docx</w:t>
+            </w:r>
+          </w:p>
+        </w:tc>
+        <w:tc>
+          <w:tcPr/>
+          <w:p>
+            <w:pPr>
+              <w:pStyle w:val="Compact"/>
+              <w:jc w:val="left"/>
+            </w:pPr>
+            <w:r>
+              <w:t xml:space="preserve">Pre/Post + Before/After Feedback + Application</w:t>
+            </w:r>
+          </w:p>
+        </w:tc>
+        <w:tc>
+          <w:tcPr/>
+          <w:p>
+            <w:pPr>
+              <w:pStyle w:val="Compact"/>
+              <w:jc w:val="left"/>
+            </w:pPr>
+            <w:r>
+              <w:t xml:space="preserve">หลักฐานรายบุคคล</w:t>
             </w:r>
           </w:p>
         </w:tc>
@@ -682,31 +697,31 @@
               <w:jc w:val="left"/>
             </w:pPr>
             <w:r>
-              <w:t xml:space="preserve">media/QR_Student_Game.png</w:t>
-            </w:r>
-          </w:p>
-        </w:tc>
-        <w:tc>
-          <w:tcPr/>
-          <w:p>
-            <w:pPr>
-              <w:pStyle w:val="Compact"/>
-              <w:jc w:val="left"/>
-            </w:pPr>
-            <w:r>
-              <w:t xml:space="preserve">QR เกมนักเรียน</w:t>
-            </w:r>
-          </w:p>
-        </w:tc>
-        <w:tc>
-          <w:tcPr/>
-          <w:p>
-            <w:pPr>
-              <w:pStyle w:val="Compact"/>
-              <w:jc w:val="left"/>
-            </w:pPr>
-            <w:r>
-              <w:t xml:space="preserve">แนบ/เก็บเป็นหลักฐาน</w:t>
+              <w:t xml:space="preserve">09_แบบบันทึกหลังสอนและสรุปผล_WPA.docx</w:t>
+            </w:r>
+          </w:p>
+        </w:tc>
+        <w:tc>
+          <w:tcPr/>
+          <w:p>
+            <w:pPr>
+              <w:pStyle w:val="Compact"/>
+              <w:jc w:val="left"/>
+            </w:pPr>
+            <w:r>
+              <w:t xml:space="preserve">กรอกผลจริงหลังสอน</w:t>
+            </w:r>
+          </w:p>
+        </w:tc>
+        <w:tc>
+          <w:tcPr/>
+          <w:p>
+            <w:pPr>
+              <w:pStyle w:val="Compact"/>
+              <w:jc w:val="left"/>
+            </w:pPr>
+            <w:r>
+              <w:t xml:space="preserve">หลักฐานสะท้อนผล</w:t>
             </w:r>
           </w:p>
         </w:tc>
@@ -720,31 +735,31 @@
               <w:jc w:val="left"/>
             </w:pPr>
             <w:r>
-              <w:t xml:space="preserve">media/QR_Teacher_Summary.png</w:t>
-            </w:r>
-          </w:p>
-        </w:tc>
-        <w:tc>
-          <w:tcPr/>
-          <w:p>
-            <w:pPr>
-              <w:pStyle w:val="Compact"/>
-              <w:jc w:val="left"/>
-            </w:pPr>
-            <w:r>
-              <w:t xml:space="preserve">QR หน้าสรุปครู</w:t>
-            </w:r>
-          </w:p>
-        </w:tc>
-        <w:tc>
-          <w:tcPr/>
-          <w:p>
-            <w:pPr>
-              <w:pStyle w:val="Compact"/>
-              <w:jc w:val="left"/>
-            </w:pPr>
-            <w:r>
-              <w:t xml:space="preserve">แนบ/เก็บเป็นหลักฐาน</w:t>
+              <w:t xml:space="preserve">10_การจัดวางกิจกรรม_AI_to_ESP32_ในโครงสร้างรายวิชา_W31101.docx</w:t>
+            </w:r>
+          </w:p>
+        </w:tc>
+        <w:tc>
+          <w:tcPr/>
+          <w:p>
+            <w:pPr>
+              <w:pStyle w:val="Compact"/>
+              <w:jc w:val="left"/>
+            </w:pPr>
+            <w:r>
+              <w:t xml:space="preserve">แผนผังเชื่อมโครงสร้างรายวิชาและลำดับ 22 ชั่วโมง</w:t>
+            </w:r>
+          </w:p>
+        </w:tc>
+        <w:tc>
+          <w:tcPr/>
+          <w:p>
+            <w:pPr>
+              <w:pStyle w:val="Compact"/>
+              <w:jc w:val="left"/>
+            </w:pPr>
+            <w:r>
+              <w:t xml:space="preserve">เอกสารอธิบายความสอดคล้อง</w:t>
             </w:r>
           </w:p>
         </w:tc>
@@ -758,31 +773,31 @@
               <w:jc w:val="left"/>
             </w:pPr>
             <w:r>
-              <w:t xml:space="preserve">07_แบบประเมินก่อนเรียน_5ข้อ_พร้อมเฉลย.docx</w:t>
-            </w:r>
-          </w:p>
-        </w:tc>
-        <w:tc>
-          <w:tcPr/>
-          <w:p>
-            <w:pPr>
-              <w:pStyle w:val="Compact"/>
-              <w:jc w:val="left"/>
-            </w:pPr>
-            <w:r>
-              <w:t xml:space="preserve">Pre-test 5 ข้อ ใช้วินิจฉัยความรู้เดิมและคำนวณพัฒนาการ</w:t>
-            </w:r>
-          </w:p>
-        </w:tc>
-        <w:tc>
-          <w:tcPr/>
-          <w:p>
-            <w:pPr>
-              <w:pStyle w:val="Compact"/>
-              <w:jc w:val="left"/>
-            </w:pPr>
-            <w:r>
-              <w:t xml:space="preserve">แนบ/เก็บเป็นหลักฐาน</w:t>
+              <w:t xml:space="preserve">media/QR_Student_Game.png</w:t>
+            </w:r>
+          </w:p>
+        </w:tc>
+        <w:tc>
+          <w:tcPr/>
+          <w:p>
+            <w:pPr>
+              <w:pStyle w:val="Compact"/>
+              <w:jc w:val="left"/>
+            </w:pPr>
+            <w:r>
+              <w:t xml:space="preserve">QR เกมนักเรียน</w:t>
+            </w:r>
+          </w:p>
+        </w:tc>
+        <w:tc>
+          <w:tcPr/>
+          <w:p>
+            <w:pPr>
+              <w:pStyle w:val="Compact"/>
+              <w:jc w:val="left"/>
+            </w:pPr>
+            <w:r>
+              <w:t xml:space="preserve">สื่อ</w:t>
             </w:r>
           </w:p>
         </w:tc>
@@ -796,82 +811,80 @@
               <w:jc w:val="left"/>
             </w:pPr>
             <w:r>
-              <w:t xml:space="preserve">08_แบบประเมินพัฒนาการรายบุคคล_AI_to_ESP32.docx</w:t>
-            </w:r>
-          </w:p>
-        </w:tc>
-        <w:tc>
-          <w:tcPr/>
-          <w:p>
-            <w:pPr>
-              <w:pStyle w:val="Compact"/>
-              <w:jc w:val="left"/>
-            </w:pPr>
-            <w:r>
-              <w:t xml:space="preserve">เปรียบเทียบ Pre/Post และพัฒนาการจากผลงานจริง</w:t>
-            </w:r>
-          </w:p>
-        </w:tc>
-        <w:tc>
-          <w:tcPr/>
-          <w:p>
-            <w:pPr>
-              <w:pStyle w:val="Compact"/>
-              <w:jc w:val="left"/>
-            </w:pPr>
-            <w:r>
-              <w:t xml:space="preserve">แนบ/เก็บเป็นหลักฐาน</w:t>
-            </w:r>
-          </w:p>
-        </w:tc>
-      </w:tr>
-      <w:tr>
-        <w:tc>
-          <w:tcPr/>
-          <w:p>
-            <w:pPr>
-              <w:pStyle w:val="Compact"/>
-              <w:jc w:val="left"/>
-            </w:pPr>
-            <w:r>
-              <w:t xml:space="preserve">09_แบบบันทึกหลังสอนและสรุปผล_WPA.docx</w:t>
-            </w:r>
-          </w:p>
-        </w:tc>
-        <w:tc>
-          <w:tcPr/>
-          <w:p>
-            <w:pPr>
-              <w:pStyle w:val="Compact"/>
-              <w:jc w:val="left"/>
-            </w:pPr>
-            <w:r>
-              <w:t xml:space="preserve">บันทึกผลหลังสอน ปัญหา การแก้ไข และหลักฐานผลลัพธ์</w:t>
-            </w:r>
-          </w:p>
-        </w:tc>
-        <w:tc>
-          <w:tcPr/>
-          <w:p>
-            <w:pPr>
-              <w:pStyle w:val="Compact"/>
-              <w:jc w:val="left"/>
-            </w:pPr>
-            <w:r>
-              <w:t xml:space="preserve">แนบ/เก็บเป็นหลักฐาน</w:t>
+              <w:t xml:space="preserve">media/QR_Teacher_Summary.png</w:t>
+            </w:r>
+          </w:p>
+        </w:tc>
+        <w:tc>
+          <w:tcPr/>
+          <w:p>
+            <w:pPr>
+              <w:pStyle w:val="Compact"/>
+              <w:jc w:val="left"/>
+            </w:pPr>
+            <w:r>
+              <w:t xml:space="preserve">QR Teacher Dashboard</w:t>
+            </w:r>
+          </w:p>
+        </w:tc>
+        <w:tc>
+          <w:tcPr/>
+          <w:p>
+            <w:pPr>
+              <w:pStyle w:val="Compact"/>
+              <w:jc w:val="left"/>
+            </w:pPr>
+            <w:r>
+              <w:t xml:space="preserve">สื่อ</w:t>
             </w:r>
           </w:p>
         </w:tc>
       </w:tr>
     </w:tbl>
-    <w:bookmarkEnd w:id="20"/>
-    <w:bookmarkStart w:id="21" w:name="ลำดับการเตรียมก่อนส่ง"/>
+    <w:p>
+      <w:r>
+        <w:pict>
+          <v:rect style="width:0;height:1.5pt" o:hralign="center" o:hrstd="t" o:hr="t"/>
+        </w:pict>
+      </w:r>
+    </w:p>
+    <w:bookmarkEnd w:id="22"/>
+    <w:bookmarkStart w:id="23" w:name="โครงสร้างหลักฐานที่แนะนำ"/>
     <w:p>
       <w:pPr>
         <w:pStyle w:val="Heading1"/>
       </w:pPr>
       <w:r>
-        <w:t xml:space="preserve">ลำดับการเตรียมก่อนส่ง</w:t>
+        <w:t xml:space="preserve">โครงสร้างหลักฐานที่แนะนำ</w:t>
+      </w:r>
+    </w:p>
+    <w:p>
+      <w:pPr>
+        <w:pStyle w:val="FirstParagraph"/>
+      </w:pPr>
+      <w:r>
+        <w:rPr>
+          <w:bCs/>
+          <w:b/>
+        </w:rPr>
+        <w:t xml:space="preserve">Pre-test 10 ข้อ → Problem/Prototype Context → 3 Stations → System Flow + IPO → Challenge Before Feedback → Feedback → Challenge After Feedback → Application Design → Post-test 10 ข้อ → Teacher Dashboard → บันทึกหลังสอน</w:t>
+      </w:r>
+    </w:p>
+    <w:p>
+      <w:r>
+        <w:pict>
+          <v:rect style="width:0;height:1.5pt" o:hralign="center" o:hrstd="t" o:hr="t"/>
+        </w:pict>
+      </w:r>
+    </w:p>
+    <w:bookmarkEnd w:id="23"/>
+    <w:bookmarkStart w:id="24" w:name="การประเมิน"/>
+    <w:p>
+      <w:pPr>
+        <w:pStyle w:val="Heading1"/>
+      </w:pPr>
+      <w:r>
+        <w:t xml:space="preserve">การประเมิน</w:t>
       </w:r>
     </w:p>
     <w:p>
@@ -880,9 +893,10 @@
           <w:ilvl w:val="0"/>
           <w:numId w:val="1001"/>
         </w:numPr>
-      </w:pPr>
-      <w:r>
-        <w:t xml:space="preserve">กรอกข้อมูลโรงเรียน/หน่วยการเรียนรู้/วันที่สอนในแผนฉบับเต็ม</w:t>
+        <w:pStyle w:val="Compact"/>
+      </w:pPr>
+      <w:r>
+        <w:t xml:space="preserve">Pre-test 10 ข้อ: Diagnostic ไม่คิดคะแนนผลสัมฤทธิ์</w:t>
       </w:r>
     </w:p>
     <w:p>
@@ -891,9 +905,10 @@
           <w:ilvl w:val="0"/>
           <w:numId w:val="1001"/>
         </w:numPr>
-      </w:pPr>
-      <w:r>
-        <w:t xml:space="preserve">กำหนดรายชื่อนักเรียน 40 คนและกลุ่ม 1-8 ในไฟล์คะแนน</w:t>
+        <w:pStyle w:val="Compact"/>
+      </w:pPr>
+      <w:r>
+        <w:t xml:space="preserve">ผลการปฏิบัติจริง: 90 คะแนน</w:t>
       </w:r>
     </w:p>
     <w:p>
@@ -902,9 +917,10 @@
           <w:ilvl w:val="0"/>
           <w:numId w:val="1001"/>
         </w:numPr>
-      </w:pPr>
-      <w:r>
-        <w:t xml:space="preserve">พิมพ์ใบกิจกรรมเฉพาะส่วนที่ใช้จริง</w:t>
+        <w:pStyle w:val="Compact"/>
+      </w:pPr>
+      <w:r>
+        <w:t xml:space="preserve">Post-test 10 ข้อ: 10 คะแนน</w:t>
       </w:r>
     </w:p>
     <w:p>
@@ -913,9 +929,10 @@
           <w:ilvl w:val="0"/>
           <w:numId w:val="1001"/>
         </w:numPr>
-      </w:pPr>
-      <w:r>
-        <w:t xml:space="preserve">ทดลองเกมและหน้าสรุปครูบนอุปกรณ์ที่จะใช้สอน</w:t>
+        <w:pStyle w:val="Compact"/>
+      </w:pPr>
+      <w:r>
+        <w:t xml:space="preserve">รวม 100 คะแนน</w:t>
       </w:r>
     </w:p>
     <w:p>
@@ -924,46 +941,190 @@
           <w:ilvl w:val="0"/>
           <w:numId w:val="1001"/>
         </w:numPr>
-      </w:pPr>
-      <w:r>
-        <w:t xml:space="preserve">หลังสอน นำ CSV นักเรียนเข้าหน้าสรุปครูและบันทึกผลรวม</w:t>
+        <w:pStyle w:val="Compact"/>
+      </w:pPr>
+      <w:r>
+        <w:t xml:space="preserve">Post-test ผ่าน 70% = 7/10</w:t>
+      </w:r>
+    </w:p>
+    <w:p>
+      <w:pPr>
+        <w:pStyle w:val="FirstParagraph"/>
+      </w:pPr>
+      <w:r>
+        <w:t xml:space="preserve">ผล Pre/Post ถูกส่งเข้า Teacher Dashboard ผ่าน Supabase โดยอัตโนมัติ ไม่ต้องให้นักเรียนดาวน์โหลด CSV</w:t>
+      </w:r>
+    </w:p>
+    <w:p>
+      <w:r>
+        <w:pict>
+          <v:rect style="width:0;height:1.5pt" o:hralign="center" o:hrstd="t" o:hr="t"/>
+        </w:pict>
+      </w:r>
+    </w:p>
+    <w:bookmarkEnd w:id="24"/>
+    <w:bookmarkStart w:id="25" w:name="ลำดับเตรียมก่อนสอนเก็บหลักฐาน"/>
+    <w:p>
+      <w:pPr>
+        <w:pStyle w:val="Heading1"/>
+      </w:pPr>
+      <w:r>
+        <w:t xml:space="preserve">ลำดับเตรียมก่อนสอน/เก็บหลักฐาน</w:t>
       </w:r>
     </w:p>
     <w:p>
       <w:pPr>
         <w:numPr>
           <w:ilvl w:val="0"/>
-          <w:numId w:val="1001"/>
+          <w:numId w:val="1002"/>
         </w:numPr>
-      </w:pPr>
-      <w:r>
-        <w:t xml:space="preserve">แนบตัวอย่างผลงานผู้เรียนที่สะท้อน Before-&gt;Feedback-&gt;After</w:t>
+        <w:pStyle w:val="Compact"/>
+      </w:pPr>
+      <w:r>
+        <w:t xml:space="preserve">ระบุห้องเรียนและวันที่สอนจริงในแผน</w:t>
       </w:r>
     </w:p>
     <w:p>
       <w:pPr>
         <w:numPr>
           <w:ilvl w:val="0"/>
-          <w:numId w:val="1001"/>
+          <w:numId w:val="1002"/>
         </w:numPr>
-      </w:pPr>
-      <w:r>
-        <w:t xml:space="preserve">ตรวจว่าคลิปวิดีโอเห็นพฤติกรรมผู้เรียนตามตัวชี้วัด ไม่ใช่เพียงครูบรรยาย</w:t>
+        <w:pStyle w:val="Compact"/>
+      </w:pPr>
+      <w:r>
+        <w:t xml:space="preserve">ตรวจว่าเนื้อหาก่อนคาบนี้เชื่อมจาก IPO/System Flow และ Prototype v1</w:t>
       </w:r>
     </w:p>
     <w:p>
       <w:pPr>
         <w:numPr>
           <w:ilvl w:val="0"/>
-          <w:numId w:val="1001"/>
+          <w:numId w:val="1002"/>
         </w:numPr>
-      </w:pPr>
-      <w:r>
-        <w:t xml:space="preserve">ตรวจหลักเกณฑ์ ก.ค.ศ./ต้นสังกัดฉบับปัจจุบันอีกครั้งก่อนยื่นจริง</w:t>
-      </w:r>
-    </w:p>
-    <w:bookmarkEnd w:id="21"/>
-    <w:bookmarkStart w:id="26" w:name="ลิงก์สื่อ"/>
+        <w:pStyle w:val="Compact"/>
+      </w:pPr>
+      <w:r>
+        <w:t xml:space="preserve">เตรียม Station A/B/C, Challenge Cards และ Application Design Cards</w:t>
+      </w:r>
+    </w:p>
+    <w:p>
+      <w:pPr>
+        <w:numPr>
+          <w:ilvl w:val="0"/>
+          <w:numId w:val="1002"/>
+        </w:numPr>
+        <w:pStyle w:val="Compact"/>
+      </w:pPr>
+      <w:r>
+        <w:t xml:space="preserve">ทดสอบ AI Hand Quest, Webcam, ESP32</w:t>
+      </w:r>
+      <w:r>
+        <w:t xml:space="preserve"> </w:t>
+      </w:r>
+      <w:r>
+        <w:rPr>
+          <w:rStyle w:val="VerbatimChar"/>
+        </w:rPr>
+        <w:t xml:space="preserve">/on</w:t>
+      </w:r>
+      <w:r>
+        <w:t xml:space="preserve"> </w:t>
+      </w:r>
+      <w:r>
+        <w:rPr>
+          <w:rStyle w:val="VerbatimChar"/>
+        </w:rPr>
+        <w:t xml:space="preserve">/off</w:t>
+      </w:r>
+      <w:r>
+        <w:t xml:space="preserve"> </w:t>
+      </w:r>
+      <w:r>
+        <w:t xml:space="preserve">และ Teacher Dashboard</w:t>
+      </w:r>
+    </w:p>
+    <w:p>
+      <w:pPr>
+        <w:numPr>
+          <w:ilvl w:val="0"/>
+          <w:numId w:val="1002"/>
+        </w:numPr>
+        <w:pStyle w:val="Compact"/>
+      </w:pPr>
+      <w:r>
+        <w:t xml:space="preserve">ทดสอบการส่งผลเข้า Supabase ด้วยข้อมูลจำลอง 1 คน แล้วลบข้อมูลทดสอบ</w:t>
+      </w:r>
+    </w:p>
+    <w:p>
+      <w:pPr>
+        <w:numPr>
+          <w:ilvl w:val="0"/>
+          <w:numId w:val="1002"/>
+        </w:numPr>
+        <w:pStyle w:val="Compact"/>
+      </w:pPr>
+      <w:r>
+        <w:t xml:space="preserve">ระหว่างสอนเก็บ Before → Feedback → After ให้ชัด</w:t>
+      </w:r>
+    </w:p>
+    <w:p>
+      <w:pPr>
+        <w:numPr>
+          <w:ilvl w:val="0"/>
+          <w:numId w:val="1002"/>
+        </w:numPr>
+        <w:pStyle w:val="Compact"/>
+      </w:pPr>
+      <w:r>
+        <w:t xml:space="preserve">หลังสอนเปิด Teacher Dashboard และบันทึกเฉพาะผลจริง</w:t>
+      </w:r>
+    </w:p>
+    <w:p>
+      <w:pPr>
+        <w:numPr>
+          <w:ilvl w:val="0"/>
+          <w:numId w:val="1002"/>
+        </w:numPr>
+        <w:pStyle w:val="Compact"/>
+      </w:pPr>
+      <w:r>
+        <w:t xml:space="preserve">แนบตัวอย่าง System Flow, Debugging และ Application Design ของผู้เรียน</w:t>
+      </w:r>
+    </w:p>
+    <w:p>
+      <w:pPr>
+        <w:numPr>
+          <w:ilvl w:val="0"/>
+          <w:numId w:val="1002"/>
+        </w:numPr>
+        <w:pStyle w:val="Compact"/>
+      </w:pPr>
+      <w:r>
+        <w:t xml:space="preserve">ตรวจว่าคลิปเห็นการคิด/ลงมือของผู้เรียนมากกว่าการบรรยายของครู</w:t>
+      </w:r>
+    </w:p>
+    <w:p>
+      <w:pPr>
+        <w:numPr>
+          <w:ilvl w:val="0"/>
+          <w:numId w:val="1002"/>
+        </w:numPr>
+        <w:pStyle w:val="Compact"/>
+      </w:pPr>
+      <w:r>
+        <w:t xml:space="preserve">ตรวจหลักเกณฑ์ ก.ค.ศ./ต้นสังกัดฉบับปัจจุบันก่อนยื่นจริง</w:t>
+      </w:r>
+    </w:p>
+    <w:p>
+      <w:r>
+        <w:pict>
+          <v:rect style="width:0;height:1.5pt" o:hralign="center" o:hrstd="t" o:hr="t"/>
+        </w:pict>
+      </w:r>
+    </w:p>
+    <w:bookmarkEnd w:id="25"/>
+    <w:bookmarkStart w:id="29" w:name="ลิงก์สื่อ"/>
     <w:p>
       <w:pPr>
         <w:pStyle w:val="Heading1"/>
@@ -986,7 +1147,7 @@
       <w:r>
         <w:t xml:space="preserve"> </w:t>
       </w:r>
-      <w:hyperlink r:id="rId22">
+      <w:hyperlink r:id="rId26">
         <w:r>
           <w:rPr>
             <w:rStyle w:val="Hyperlink"/>
@@ -994,11 +1155,30 @@
           <w:t xml:space="preserve">https://arty2525.github.io/AI-Hand-Quest/</w:t>
         </w:r>
       </w:hyperlink>
-    </w:p>
-    <w:p>
-      <w:pPr>
-        <w:pStyle w:val="BodyText"/>
-      </w:pPr>
+      <w:r>
+        <w:br/>
+      </w:r>
+      <w:r>
+        <w:rPr>
+          <w:bCs/>
+          <w:b/>
+        </w:rPr>
+        <w:t xml:space="preserve">แบบทดสอบหลังเรียนโดยตรง:</w:t>
+      </w:r>
+      <w:r>
+        <w:t xml:space="preserve"> </w:t>
+      </w:r>
+      <w:hyperlink r:id="rId27">
+        <w:r>
+          <w:rPr>
+            <w:rStyle w:val="Hyperlink"/>
+          </w:rPr>
+          <w:t xml:space="preserve">https://arty2525.github.io/AI-Hand-Quest/post-test.html</w:t>
+        </w:r>
+      </w:hyperlink>
+      <w:r>
+        <w:br/>
+      </w:r>
       <w:r>
         <w:rPr>
           <w:bCs/>
@@ -1009,7 +1189,7 @@
       <w:r>
         <w:t xml:space="preserve"> </w:t>
       </w:r>
-      <w:hyperlink r:id="rId23">
+      <w:hyperlink r:id="rId28">
         <w:r>
           <w:rPr>
             <w:rStyle w:val="Hyperlink"/>
@@ -1019,64 +1199,39 @@
       </w:hyperlink>
     </w:p>
     <w:p>
+      <w:r>
+        <w:pict>
+          <v:rect style="width:0;height:1.5pt" o:hralign="center" o:hrstd="t" o:hr="t"/>
+        </w:pict>
+      </w:r>
+    </w:p>
+    <w:bookmarkEnd w:id="29"/>
+    <w:bookmarkStart w:id="30" w:name="หมายเหตุ"/>
+    <w:p>
+      <w:pPr>
+        <w:pStyle w:val="Heading1"/>
+      </w:pPr>
+      <w:r>
+        <w:t xml:space="preserve">หมายเหตุ</w:t>
+      </w:r>
+    </w:p>
+    <w:p>
+      <w:pPr>
+        <w:pStyle w:val="FirstParagraph"/>
+      </w:pPr>
+      <w:r>
+        <w:t xml:space="preserve">Supabase และ Teacher Dashboard เป็นเครื่องมือเก็บ/สรุปหลักฐานการประเมิน ไม่ใช่สาระการเรียนรู้ของผู้เรียน</w:t>
+      </w:r>
+    </w:p>
+    <w:p>
       <w:pPr>
         <w:pStyle w:val="BodyText"/>
       </w:pPr>
       <w:r>
-        <w:rPr>
-          <w:bCs/>
-          <w:b/>
-        </w:rPr>
-        <w:t xml:space="preserve">หมายเหตุการตรวจสอบกรอบ วPA ล่าสุด</w:t>
-      </w:r>
-    </w:p>
-    <w:p>
-      <w:pPr>
-        <w:pStyle w:val="BodyText"/>
-      </w:pPr>
-      <w:r>
-        <w:t xml:space="preserve">ชุดนี้อ้างอิง ว9/2564 ตำแหน่งครู และการแก้ไขเพิ่มเติม ล 1222/2568 โดยตรวจหน้าเอกสาร PA ของสำนักงาน ก.ค.ศ. ณ วันที่ 24 สิงหาคม 2569 ทั้งนี้ก่อนยื่นจริงควรตรวจประกาศ/แนวปฏิบัติของ ก.ค.ศ. และต้นสังกัดอีกครั้ง</w:t>
-      </w:r>
-    </w:p>
-    <w:p>
-      <w:pPr>
-        <w:pStyle w:val="BodyText"/>
-      </w:pPr>
-      <w:r>
-        <w:t xml:space="preserve">อ้างอิง:</w:t>
-      </w:r>
-      <w:r>
-        <w:t xml:space="preserve"> </w:t>
-      </w:r>
-      <w:hyperlink r:id="rId24">
-        <w:r>
-          <w:rPr>
-            <w:rStyle w:val="Hyperlink"/>
-          </w:rPr>
-          <w:t xml:space="preserve">https://otepc.go.th/th/pa-download.html</w:t>
-        </w:r>
-      </w:hyperlink>
-    </w:p>
-    <w:p>
-      <w:pPr>
-        <w:pStyle w:val="BodyText"/>
-      </w:pPr>
-      <w:r>
-        <w:t xml:space="preserve">สรุปเส้นทางการแก้ไขเพิ่มเติม วPA (18 ส.ค. 2569):</w:t>
-      </w:r>
-      <w:r>
-        <w:t xml:space="preserve"> </w:t>
-      </w:r>
-      <w:hyperlink r:id="rId25">
-        <w:r>
-          <w:rPr>
-            <w:rStyle w:val="Hyperlink"/>
-          </w:rPr>
-          <w:t xml:space="preserve">https://otepc.go.th/en/content_page/item/5971-pa-3.html</w:t>
-        </w:r>
-      </w:hyperlink>
-    </w:p>
-    <w:bookmarkEnd w:id="26"/>
+        <w:t xml:space="preserve">ชุดนี้อ้างอิงกรอบ วPA ตำแหน่งครูตามเอกสารที่ผู้จัดทำตรวจสอบไว้ และควรตรวจประกาศ/แนวปฏิบัติฉบับปัจจุบันอีกครั้งก่อนยื่นจริง</w:t>
+      </w:r>
+    </w:p>
+    <w:bookmarkEnd w:id="30"/>
     <w:sectPr/>
   </w:body>
 </w:document>
@@ -1183,6 +1338,82 @@
       </w:pPr>
     </w:lvl>
   </w:abstractNum>
+  <w:abstractNum w:abstractNumId="991">
+    <w:nsid w:val="A991"/>
+    <w:multiLevelType w:val="multilevel"/>
+    <w:lvl w:ilvl="0">
+      <w:numFmt w:val="bullet"/>
+      <w:lvlText w:val="•"/>
+      <w:lvlJc w:val="left"/>
+      <w:pPr>
+        <w:ind w:left="720" w:hanging="480"/>
+      </w:pPr>
+    </w:lvl>
+    <w:lvl w:ilvl="1">
+      <w:numFmt w:val="bullet"/>
+      <w:lvlText w:val="–"/>
+      <w:lvlJc w:val="left"/>
+      <w:pPr>
+        <w:ind w:left="1440" w:hanging="480"/>
+      </w:pPr>
+    </w:lvl>
+    <w:lvl w:ilvl="2">
+      <w:numFmt w:val="bullet"/>
+      <w:lvlText w:val="•"/>
+      <w:lvlJc w:val="left"/>
+      <w:pPr>
+        <w:ind w:left="2160" w:hanging="480"/>
+      </w:pPr>
+    </w:lvl>
+    <w:lvl w:ilvl="3">
+      <w:numFmt w:val="bullet"/>
+      <w:lvlText w:val="–"/>
+      <w:lvlJc w:val="left"/>
+      <w:pPr>
+        <w:ind w:left="2880" w:hanging="480"/>
+      </w:pPr>
+    </w:lvl>
+    <w:lvl w:ilvl="4">
+      <w:numFmt w:val="bullet"/>
+      <w:lvlText w:val="•"/>
+      <w:lvlJc w:val="left"/>
+      <w:pPr>
+        <w:ind w:left="3600" w:hanging="480"/>
+      </w:pPr>
+    </w:lvl>
+    <w:lvl w:ilvl="5">
+      <w:numFmt w:val="bullet"/>
+      <w:lvlText w:val="–"/>
+      <w:lvlJc w:val="left"/>
+      <w:pPr>
+        <w:ind w:left="4320" w:hanging="480"/>
+      </w:pPr>
+    </w:lvl>
+    <w:lvl w:ilvl="6">
+      <w:numFmt w:val="bullet"/>
+      <w:lvlText w:val="•"/>
+      <w:lvlJc w:val="left"/>
+      <w:pPr>
+        <w:ind w:left="5040" w:hanging="480"/>
+      </w:pPr>
+    </w:lvl>
+    <w:lvl w:ilvl="7">
+      <w:numFmt w:val="bullet"/>
+      <w:lvlText w:val="–"/>
+      <w:lvlJc w:val="left"/>
+      <w:pPr>
+        <w:ind w:left="5760" w:hanging="480"/>
+      </w:pPr>
+    </w:lvl>
+    <w:lvl w:ilvl="8">
+      <w:numFmt w:val="bullet"/>
+      <w:lvlText w:val="•"/>
+      <w:lvlJc w:val="left"/>
+      <w:pPr>
+        <w:ind w:left="6480" w:hanging="480"/>
+      </w:pPr>
+    </w:lvl>
+  </w:abstractNum>
   <w:abstractNum w:abstractNumId="99411">
     <w:nsid w:val="A99411"/>
     <w:multiLevelType w:val="multilevel"/>
@@ -1272,6 +1503,9 @@
     <w:abstractNumId w:val="990"/>
   </w:num>
   <w:num w:numId="1001">
+    <w:abstractNumId w:val="991"/>
+  </w:num>
+  <w:num w:numId="1002">
     <w:abstractNumId w:val="99411"/>
     <w:lvlOverride w:ilvl="0">
       <w:startOverride w:val="1"/>

</xml_diff>